<commit_message>
Regole di approvazione, scheda Classi, nomi classi in arabo, fix Manutenzione
</commit_message>
<xml_diff>
--- a/manuali/manuale-amministrativo-ar.docx
+++ b/manuali/manuale-amministrativo-ar.docx
@@ -61,7 +61,7 @@
           <w:rtl/>
           <w:lang w:bidi="ar-SA"/>
         </w:rPr>
-        <w:t xml:space="preserve">الإصدار: سبتمبر 2026</w:t>
+        <w:t xml:space="preserve">الإصدار: أكتوبر ٢٠٢٦</w:t>
       </w:r>
     </w:p>
     <w:p>
@@ -81,7 +81,7 @@
         </w:pBdr>
         <w:bidi/>
         <w:spacing w:after="160" w:before="320"/>
-        <w:jc w:val="right"/>
+        <w:jc w:val="left"/>
       </w:pPr>
       <w:r>
         <w:rPr>
@@ -101,7 +101,7 @@
       <w:pPr>
         <w:bidi/>
         <w:spacing w:after="90" w:line="300"/>
-        <w:jc w:val="right"/>
+        <w:jc w:val="left"/>
       </w:pPr>
       <w:r>
         <w:rPr>
@@ -116,7 +116,7 @@
       <w:pPr>
         <w:bidi/>
         <w:spacing w:after="90" w:line="300"/>
-        <w:jc w:val="right"/>
+        <w:jc w:val="left"/>
       </w:pPr>
       <w:r>
         <w:rPr>
@@ -131,7 +131,7 @@
       <w:pPr>
         <w:bidi/>
         <w:spacing w:after="90" w:line="300"/>
-        <w:jc w:val="right"/>
+        <w:jc w:val="left"/>
       </w:pPr>
       <w:r>
         <w:rPr>
@@ -146,7 +146,7 @@
       <w:pPr>
         <w:bidi/>
         <w:spacing w:after="90" w:line="300"/>
-        <w:jc w:val="right"/>
+        <w:jc w:val="left"/>
       </w:pPr>
       <w:r>
         <w:rPr>
@@ -161,7 +161,7 @@
       <w:pPr>
         <w:bidi/>
         <w:spacing w:after="90" w:line="300"/>
-        <w:jc w:val="right"/>
+        <w:jc w:val="left"/>
       </w:pPr>
       <w:r>
         <w:rPr>
@@ -176,7 +176,7 @@
       <w:pPr>
         <w:bidi/>
         <w:spacing w:after="90" w:line="300"/>
-        <w:jc w:val="right"/>
+        <w:jc w:val="left"/>
       </w:pPr>
       <w:r>
         <w:rPr>
@@ -191,7 +191,7 @@
       <w:pPr>
         <w:bidi/>
         <w:spacing w:after="90" w:line="300"/>
-        <w:jc w:val="right"/>
+        <w:jc w:val="left"/>
       </w:pPr>
       <w:r>
         <w:rPr>
@@ -206,7 +206,7 @@
       <w:pPr>
         <w:bidi/>
         <w:spacing w:after="90" w:line="300"/>
-        <w:jc w:val="right"/>
+        <w:jc w:val="left"/>
       </w:pPr>
       <w:r>
         <w:rPr>
@@ -221,7 +221,7 @@
       <w:pPr>
         <w:bidi/>
         <w:spacing w:after="90" w:line="300"/>
-        <w:jc w:val="right"/>
+        <w:jc w:val="left"/>
       </w:pPr>
       <w:r>
         <w:rPr>
@@ -236,7 +236,7 @@
       <w:pPr>
         <w:bidi/>
         <w:spacing w:after="90" w:line="300"/>
-        <w:jc w:val="right"/>
+        <w:jc w:val="left"/>
       </w:pPr>
       <w:r>
         <w:rPr>
@@ -251,7 +251,7 @@
       <w:pPr>
         <w:bidi/>
         <w:spacing w:after="90" w:line="300"/>
-        <w:jc w:val="right"/>
+        <w:jc w:val="left"/>
       </w:pPr>
       <w:r>
         <w:rPr>
@@ -266,7 +266,7 @@
       <w:pPr>
         <w:bidi/>
         <w:spacing w:after="90" w:line="300"/>
-        <w:jc w:val="right"/>
+        <w:jc w:val="left"/>
       </w:pPr>
       <w:r>
         <w:rPr>
@@ -281,7 +281,7 @@
       <w:pPr>
         <w:bidi/>
         <w:spacing w:after="90" w:line="300"/>
-        <w:jc w:val="right"/>
+        <w:jc w:val="left"/>
       </w:pPr>
       <w:r>
         <w:rPr>
@@ -296,7 +296,7 @@
       <w:pPr>
         <w:bidi/>
         <w:spacing w:after="90" w:line="300"/>
-        <w:jc w:val="right"/>
+        <w:jc w:val="left"/>
       </w:pPr>
       <w:r>
         <w:rPr>
@@ -311,7 +311,7 @@
       <w:pPr>
         <w:bidi/>
         <w:spacing w:after="90" w:line="300"/>
-        <w:jc w:val="right"/>
+        <w:jc w:val="left"/>
       </w:pPr>
       <w:r>
         <w:rPr>
@@ -339,7 +339,7 @@
         </w:pBdr>
         <w:bidi/>
         <w:spacing w:after="160" w:before="320"/>
-        <w:jc w:val="right"/>
+        <w:jc w:val="left"/>
       </w:pPr>
       <w:r>
         <w:rPr>
@@ -359,22 +359,22 @@
       <w:pPr>
         <w:bidi/>
         <w:spacing w:after="160" w:line="300"/>
-        <w:jc w:val="right"/>
-      </w:pPr>
-      <w:r>
-        <w:rPr>
-          <w:rFonts w:ascii="Noto Sans Arabic" w:cs="Noto Sans Arabic" w:eastAsia="Noto Sans Arabic" w:hAnsi="Noto Sans Arabic"/>
-          <w:rtl/>
-          <w:lang w:bidi="ar-SA"/>
-        </w:rPr>
-        <w:t xml:space="preserve">هذا الدليل موجّه لكل من يدير تطبيق Gestione Aule DBALEX: المدير، السكرتارية IPI، سكرتارية المدرسة الأساسية، مدير المعهد IPI، نائب مدير المعهد IPI، مدير المدرسة الأساسية، أمين الصندوق، فني الصيانة، والأوراتوريو. يغطي جميع الوظائف المتوفرة في الإعدادات وشاشات الإدارة.</w:t>
-      </w:r>
-    </w:p>
-    <w:p>
-      <w:pPr>
-        <w:bidi/>
-        <w:spacing w:after="160" w:line="300"/>
-        <w:jc w:val="right"/>
+        <w:jc w:val="left"/>
+      </w:pPr>
+      <w:r>
+        <w:rPr>
+          <w:rFonts w:ascii="Noto Sans Arabic" w:cs="Noto Sans Arabic" w:eastAsia="Noto Sans Arabic" w:hAnsi="Noto Sans Arabic"/>
+          <w:rtl/>
+          <w:lang w:bidi="ar-SA"/>
+        </w:rPr>
+        <w:t xml:space="preserve">هذا الدليل موجّه لكل من يدير تطبيق Gestione Aule DBALEX: المدير، أمين الصندوق، السكرتارية IPI، مدير المعهد IPI، نائب مدير المعهد IPI، سكرتارية المدرسة الأساسية، مدير المدرسة الأساسية، مسؤول TEVT، سكرتارية TEVT، فني الصيانة، والأوراتوريو. يغطي جميع الوظائف المتوفرة في الإعدادات وشاشات الإدارة.</w:t>
+      </w:r>
+    </w:p>
+    <w:p>
+      <w:pPr>
+        <w:bidi/>
+        <w:spacing w:after="160" w:line="300"/>
+        <w:jc w:val="left"/>
       </w:pPr>
       <w:r>
         <w:rPr>
@@ -389,7 +389,7 @@
       <w:pPr>
         <w:bidi/>
         <w:spacing w:after="160" w:line="300"/>
-        <w:jc w:val="right"/>
+        <w:jc w:val="left"/>
       </w:pPr>
       <w:r>
         <w:rPr>
@@ -408,7 +408,7 @@
         </w:pBdr>
         <w:bidi/>
         <w:spacing w:after="160" w:before="320"/>
-        <w:jc w:val="right"/>
+        <w:jc w:val="left"/>
       </w:pPr>
       <w:r>
         <w:rPr>
@@ -428,7 +428,7 @@
       <w:pPr>
         <w:bidi/>
         <w:spacing w:after="160" w:line="300"/>
-        <w:jc w:val="right"/>
+        <w:jc w:val="left"/>
       </w:pPr>
       <w:r>
         <w:rPr>
@@ -443,7 +443,7 @@
       <w:pPr>
         <w:bidi/>
         <w:spacing w:after="160" w:line="300"/>
-        <w:jc w:val="right"/>
+        <w:jc w:val="left"/>
       </w:pPr>
       <w:r>
         <w:rPr>
@@ -458,7 +458,7 @@
       <w:pPr>
         <w:bidi/>
         <w:spacing w:after="160" w:line="300"/>
-        <w:jc w:val="right"/>
+        <w:jc w:val="left"/>
       </w:pPr>
       <w:r>
         <w:rPr>
@@ -477,7 +477,7 @@
         </w:pBdr>
         <w:bidi/>
         <w:spacing w:after="160" w:before="320"/>
-        <w:jc w:val="right"/>
+        <w:jc w:val="left"/>
       </w:pPr>
       <w:r>
         <w:rPr>
@@ -497,7 +497,7 @@
       <w:pPr>
         <w:bidi/>
         <w:spacing w:after="160" w:line="300"/>
-        <w:jc w:val="right"/>
+        <w:jc w:val="left"/>
       </w:pPr>
       <w:r>
         <w:rPr>
@@ -512,7 +512,7 @@
       <w:pPr>
         <w:bidi/>
         <w:spacing w:after="160" w:line="300"/>
-        <w:jc w:val="right"/>
+        <w:jc w:val="left"/>
       </w:pPr>
       <w:r>
         <w:rPr>
@@ -527,7 +527,7 @@
       <w:pPr>
         <w:bidi/>
         <w:spacing w:after="160" w:line="300"/>
-        <w:jc w:val="right"/>
+        <w:jc w:val="left"/>
       </w:pPr>
       <w:r>
         <w:rPr>
@@ -546,7 +546,7 @@
         </w:pBdr>
         <w:bidi/>
         <w:spacing w:after="160" w:before="320"/>
-        <w:jc w:val="right"/>
+        <w:jc w:val="left"/>
       </w:pPr>
       <w:r>
         <w:rPr>
@@ -566,7 +566,7 @@
       <w:pPr>
         <w:bidi/>
         <w:spacing w:after="160" w:line="300"/>
-        <w:jc w:val="right"/>
+        <w:jc w:val="left"/>
       </w:pPr>
       <w:r>
         <w:rPr>
@@ -582,7 +582,7 @@
         <w:pStyle w:val="Heading2"/>
         <w:bidi/>
         <w:spacing w:after="160" w:before="320"/>
-        <w:jc w:val="right"/>
+        <w:jc w:val="left"/>
       </w:pPr>
       <w:r>
         <w:rPr>
@@ -607,7 +607,7 @@
         </w:numPr>
         <w:bidi/>
         <w:spacing w:after="100" w:line="300"/>
-        <w:jc w:val="right"/>
+        <w:jc w:val="left"/>
       </w:pPr>
       <w:r>
         <w:rPr>
@@ -627,7 +627,7 @@
         </w:numPr>
         <w:bidi/>
         <w:spacing w:after="100" w:line="300"/>
-        <w:jc w:val="right"/>
+        <w:jc w:val="left"/>
       </w:pPr>
       <w:r>
         <w:rPr>
@@ -647,7 +647,7 @@
         </w:numPr>
         <w:bidi/>
         <w:spacing w:after="100" w:line="300"/>
-        <w:jc w:val="right"/>
+        <w:jc w:val="left"/>
       </w:pPr>
       <w:r>
         <w:rPr>
@@ -667,7 +667,7 @@
         </w:numPr>
         <w:bidi/>
         <w:spacing w:after="100" w:line="300"/>
-        <w:jc w:val="right"/>
+        <w:jc w:val="left"/>
       </w:pPr>
       <w:r>
         <w:rPr>
@@ -687,7 +687,7 @@
         </w:numPr>
         <w:bidi/>
         <w:spacing w:after="100" w:line="300"/>
-        <w:jc w:val="right"/>
+        <w:jc w:val="left"/>
       </w:pPr>
       <w:r>
         <w:rPr>
@@ -707,7 +707,7 @@
         </w:numPr>
         <w:bidi/>
         <w:spacing w:after="100" w:line="300"/>
-        <w:jc w:val="right"/>
+        <w:jc w:val="left"/>
       </w:pPr>
       <w:r>
         <w:rPr>
@@ -722,7 +722,7 @@
       <w:pPr>
         <w:bidi/>
         <w:spacing w:after="160" w:line="300"/>
-        <w:jc w:val="right"/>
+        <w:jc w:val="left"/>
       </w:pPr>
       <w:r>
         <w:rPr>
@@ -738,7 +738,7 @@
         <w:pStyle w:val="Heading2"/>
         <w:bidi/>
         <w:spacing w:after="160" w:before="320"/>
-        <w:jc w:val="right"/>
+        <w:jc w:val="left"/>
       </w:pPr>
       <w:r>
         <w:rPr>
@@ -758,7 +758,7 @@
       <w:pPr>
         <w:bidi/>
         <w:spacing w:after="160" w:line="300"/>
-        <w:jc w:val="right"/>
+        <w:jc w:val="left"/>
       </w:pPr>
       <w:r>
         <w:rPr>
@@ -773,7 +773,7 @@
       <w:pPr>
         <w:bidi/>
         <w:spacing w:after="160" w:line="300"/>
-        <w:jc w:val="right"/>
+        <w:jc w:val="left"/>
       </w:pPr>
       <w:r>
         <w:rPr>
@@ -789,7 +789,7 @@
         <w:pStyle w:val="Heading2"/>
         <w:bidi/>
         <w:spacing w:after="160" w:before="320"/>
-        <w:jc w:val="right"/>
+        <w:jc w:val="left"/>
       </w:pPr>
       <w:r>
         <w:rPr>
@@ -809,7 +809,7 @@
       <w:pPr>
         <w:bidi/>
         <w:spacing w:after="160" w:line="300"/>
-        <w:jc w:val="right"/>
+        <w:jc w:val="left"/>
       </w:pPr>
       <w:r>
         <w:rPr>
@@ -825,7 +825,7 @@
         <w:pStyle w:val="Heading2"/>
         <w:bidi/>
         <w:spacing w:after="160" w:before="320"/>
-        <w:jc w:val="right"/>
+        <w:jc w:val="left"/>
       </w:pPr>
       <w:r>
         <w:rPr>
@@ -845,7 +845,7 @@
       <w:pPr>
         <w:bidi/>
         <w:spacing w:after="160" w:line="300"/>
-        <w:jc w:val="right"/>
+        <w:jc w:val="left"/>
       </w:pPr>
       <w:r>
         <w:rPr>
@@ -864,7 +864,7 @@
         </w:pBdr>
         <w:bidi/>
         <w:spacing w:after="160" w:before="320"/>
-        <w:jc w:val="right"/>
+        <w:jc w:val="left"/>
       </w:pPr>
       <w:r>
         <w:rPr>
@@ -884,7 +884,7 @@
       <w:pPr>
         <w:bidi/>
         <w:spacing w:after="160" w:line="300"/>
-        <w:jc w:val="right"/>
+        <w:jc w:val="left"/>
       </w:pPr>
       <w:r>
         <w:rPr>
@@ -900,7 +900,7 @@
         <w:pStyle w:val="Heading2"/>
         <w:bidi/>
         <w:spacing w:after="160" w:before="320"/>
-        <w:jc w:val="right"/>
+        <w:jc w:val="left"/>
       </w:pPr>
       <w:r>
         <w:rPr>
@@ -920,15 +920,15 @@
       <w:pPr>
         <w:bidi/>
         <w:spacing w:after="160" w:line="300"/>
-        <w:jc w:val="right"/>
-      </w:pPr>
-      <w:r>
-        <w:rPr>
-          <w:rFonts w:ascii="Noto Sans Arabic" w:cs="Noto Sans Arabic" w:eastAsia="Noto Sans Arabic" w:hAnsi="Noto Sans Arabic"/>
-          <w:rtl/>
-          <w:lang w:bidi="ar-SA"/>
-        </w:rPr>
-        <w:t xml:space="preserve">"+ إضافة قسم" يطلب الاسم بالإيطالية، واختيارياً بالعربية. لكل قسم زرّا تعديل (نفس الحقلين) وحذف (✕). حذف قسم لا يحذف القاعات والحجوزات المرتبطة به: تبقى محفوظة في السجل.</w:t>
+        <w:jc w:val="left"/>
+      </w:pPr>
+      <w:r>
+        <w:rPr>
+          <w:rFonts w:ascii="Noto Sans Arabic" w:cs="Noto Sans Arabic" w:eastAsia="Noto Sans Arabic" w:hAnsi="Noto Sans Arabic"/>
+          <w:rtl/>
+          <w:lang w:bidi="ar-SA"/>
+        </w:rPr>
+        <w:t xml:space="preserve">"+ إضافة قسم" يطلب الاسم بالإيطالية، واختيارياً بالعربية. لكل قسم زرّا تعديل (نفس الحقلين) وحذف (✕). الأقسام الأربعة الثابتة — التعليم الأساسي (الحضانة والابتدائي والإعدادي)، المعهد الصناعي، TEVT، والمناطق المشتركة — تحمل رمز القفل 🔒: يمكن إعادة تسميتها لكن لا يمكن حذفها، وتغيير اسمها لا يؤثر على قواعد الموافقة. حذف قسم أُضيف يدوياً لا يحذف القاعات والحجوزات المرتبطة به: تبقى محفوظة في السجل.</w:t>
       </w:r>
     </w:p>
     <w:p>
@@ -936,7 +936,7 @@
         <w:pStyle w:val="Heading2"/>
         <w:bidi/>
         <w:spacing w:after="160" w:before="320"/>
-        <w:jc w:val="right"/>
+        <w:jc w:val="left"/>
       </w:pPr>
       <w:r>
         <w:rPr>
@@ -956,7 +956,7 @@
       <w:pPr>
         <w:bidi/>
         <w:spacing w:after="160" w:line="300"/>
-        <w:jc w:val="right"/>
+        <w:jc w:val="left"/>
       </w:pPr>
       <w:r>
         <w:rPr>
@@ -971,7 +971,22 @@
       <w:pPr>
         <w:bidi/>
         <w:spacing w:after="160" w:line="300"/>
-        <w:jc w:val="right"/>
+        <w:jc w:val="left"/>
+      </w:pPr>
+      <w:r>
+        <w:rPr>
+          <w:rFonts w:ascii="Noto Sans Arabic" w:cs="Noto Sans Arabic" w:eastAsia="Noto Sans Arabic" w:hAnsi="Noto Sans Arabic"/>
+          <w:rtl/>
+          <w:lang w:bidi="ar-SA"/>
+        </w:rPr>
+        <w:t xml:space="preserve">في التعليم الأساسي وفي المعهد الصناعي يعرض البند الثابت «الفصول» فصول الإعدادات ← الفصول (الإعدادية في التعليم الأساسي، وفصول IPI في المعهد الصناعي) كقاعات قابلة للحجز: يتم تعديل الاسم والسعة والسنة من هناك وليس من هذه الشاشة. يمكن حظر الفصول من هنا، بزر «حظر»، مثل باقي القاعات.</w:t>
+      </w:r>
+    </w:p>
+    <w:p>
+      <w:pPr>
+        <w:bidi/>
+        <w:spacing w:after="160" w:line="300"/>
+        <w:jc w:val="left"/>
       </w:pPr>
       <w:r>
         <w:rPr>
@@ -990,7 +1005,7 @@
         </w:pBdr>
         <w:bidi/>
         <w:spacing w:after="160" w:before="320"/>
-        <w:jc w:val="right"/>
+        <w:jc w:val="left"/>
       </w:pPr>
       <w:r>
         <w:rPr>
@@ -1010,7 +1025,7 @@
       <w:pPr>
         <w:bidi/>
         <w:spacing w:after="160" w:line="300"/>
-        <w:jc w:val="right"/>
+        <w:jc w:val="left"/>
       </w:pPr>
       <w:r>
         <w:rPr>
@@ -1025,7 +1040,7 @@
       <w:pPr>
         <w:bidi/>
         <w:spacing w:after="160" w:line="300"/>
-        <w:jc w:val="right"/>
+        <w:jc w:val="left"/>
       </w:pPr>
       <w:r>
         <w:rPr>
@@ -1040,7 +1055,7 @@
       <w:pPr>
         <w:bidi/>
         <w:spacing w:after="160" w:line="300"/>
-        <w:jc w:val="right"/>
+        <w:jc w:val="left"/>
       </w:pPr>
       <w:r>
         <w:rPr>
@@ -1055,7 +1070,7 @@
       <w:pPr>
         <w:bidi/>
         <w:spacing w:after="160" w:line="300"/>
-        <w:jc w:val="right"/>
+        <w:jc w:val="left"/>
       </w:pPr>
       <w:r>
         <w:rPr>
@@ -1070,7 +1085,7 @@
       <w:pPr>
         <w:bidi/>
         <w:spacing w:after="160" w:line="300"/>
-        <w:jc w:val="right"/>
+        <w:jc w:val="left"/>
       </w:pPr>
       <w:r>
         <w:rPr>
@@ -1079,6 +1094,162 @@
           <w:lang w:bidi="ar-SA"/>
         </w:rPr>
         <w:t xml:space="preserve">يستلم المستخدم صاحب الطلب إشعاراً تلقائياً عند الموافقة على الحجز أو رفضه.</w:t>
+      </w:r>
+    </w:p>
+    <w:p>
+      <w:pPr>
+        <w:pStyle w:val="Heading2"/>
+        <w:bidi/>
+        <w:spacing w:after="160" w:before="320"/>
+        <w:jc w:val="left"/>
+      </w:pPr>
+      <w:r>
+        <w:rPr>
+          <w:rFonts w:ascii="Noto Sans Arabic" w:cs="Noto Sans Arabic" w:eastAsia="Noto Sans Arabic" w:hAnsi="Noto Sans Arabic"/>
+          <w:b/>
+          <w:bCs/>
+          <w:color w:val="1F3B57"/>
+          <w:sz w:val="25"/>
+          <w:szCs w:val="25"/>
+          <w:rtl/>
+          <w:lang w:bidi="ar-SA"/>
+        </w:rPr>
+        <w:t xml:space="preserve">من يوافق على ماذا</w:t>
+      </w:r>
+    </w:p>
+    <w:p>
+      <w:pPr>
+        <w:pStyle w:val="ListParagraph"/>
+        <w:numPr>
+          <w:ilvl w:val="0"/>
+          <w:numId w:val="3"/>
+        </w:numPr>
+        <w:bidi/>
+        <w:spacing w:after="100" w:line="300"/>
+        <w:jc w:val="left"/>
+      </w:pPr>
+      <w:r>
+        <w:rPr>
+          <w:rFonts w:ascii="Noto Sans Arabic" w:cs="Noto Sans Arabic" w:eastAsia="Noto Sans Arabic" w:hAnsi="Noto Sans Arabic"/>
+          <w:rtl/>
+          <w:lang w:bidi="ar-SA"/>
+        </w:rPr>
+        <w:t xml:space="preserve">المدير وأمين الصندوق: يوافقان على كل شيء. وتكون حجوزاتهما معتمدة فوراً، دون انتظار ودون حد أدنى للتقديم المسبق.</w:t>
+      </w:r>
+    </w:p>
+    <w:p>
+      <w:pPr>
+        <w:pStyle w:val="ListParagraph"/>
+        <w:numPr>
+          <w:ilvl w:val="0"/>
+          <w:numId w:val="3"/>
+        </w:numPr>
+        <w:bidi/>
+        <w:spacing w:after="100" w:line="300"/>
+        <w:jc w:val="left"/>
+      </w:pPr>
+      <w:r>
+        <w:rPr>
+          <w:rFonts w:ascii="Noto Sans Arabic" w:cs="Noto Sans Arabic" w:eastAsia="Noto Sans Arabic" w:hAnsi="Noto Sans Arabic"/>
+          <w:rtl/>
+          <w:lang w:bidi="ar-SA"/>
+        </w:rPr>
+        <w:t xml:space="preserve">المعهد الصناعي — فصول السنة الأولى والثالثة: مدير المعهد IPI ونائب مدير المعهد IPI والسكرتارية IPI.</w:t>
+      </w:r>
+    </w:p>
+    <w:p>
+      <w:pPr>
+        <w:pStyle w:val="ListParagraph"/>
+        <w:numPr>
+          <w:ilvl w:val="0"/>
+          <w:numId w:val="3"/>
+        </w:numPr>
+        <w:bidi/>
+        <w:spacing w:after="100" w:line="300"/>
+        <w:jc w:val="left"/>
+      </w:pPr>
+      <w:r>
+        <w:rPr>
+          <w:rFonts w:ascii="Noto Sans Arabic" w:cs="Noto Sans Arabic" w:eastAsia="Noto Sans Arabic" w:hAnsi="Noto Sans Arabic"/>
+          <w:rtl/>
+          <w:lang w:bidi="ar-SA"/>
+        </w:rPr>
+        <w:t xml:space="preserve">المعهد الصناعي — فصول السنة الثانية: حتى الساعة ١٦:٠٠ (وقت بداية الحجز) مدير المعهد IPI ونائبه والسكرتارية IPI؛ ومن الساعة ١٦:٠٠ فصاعداً مسؤول TEVT وسكرتارية TEVT.</w:t>
+      </w:r>
+    </w:p>
+    <w:p>
+      <w:pPr>
+        <w:pStyle w:val="ListParagraph"/>
+        <w:numPr>
+          <w:ilvl w:val="0"/>
+          <w:numId w:val="3"/>
+        </w:numPr>
+        <w:bidi/>
+        <w:spacing w:after="100" w:line="300"/>
+        <w:jc w:val="left"/>
+      </w:pPr>
+      <w:r>
+        <w:rPr>
+          <w:rFonts w:ascii="Noto Sans Arabic" w:cs="Noto Sans Arabic" w:eastAsia="Noto Sans Arabic" w:hAnsi="Noto Sans Arabic"/>
+          <w:rtl/>
+          <w:lang w:bidi="ar-SA"/>
+        </w:rPr>
+        <w:t xml:space="preserve">TEVT: مسؤول TEVT وسكرتارية TEVT.</w:t>
+      </w:r>
+    </w:p>
+    <w:p>
+      <w:pPr>
+        <w:pStyle w:val="ListParagraph"/>
+        <w:numPr>
+          <w:ilvl w:val="0"/>
+          <w:numId w:val="3"/>
+        </w:numPr>
+        <w:bidi/>
+        <w:spacing w:after="100" w:line="300"/>
+        <w:jc w:val="left"/>
+      </w:pPr>
+      <w:r>
+        <w:rPr>
+          <w:rFonts w:ascii="Noto Sans Arabic" w:cs="Noto Sans Arabic" w:eastAsia="Noto Sans Arabic" w:hAnsi="Noto Sans Arabic"/>
+          <w:rtl/>
+          <w:lang w:bidi="ar-SA"/>
+        </w:rPr>
+        <w:t xml:space="preserve">التعليم الأساسي (الحضانة والابتدائي والإعدادي): مدير المدرسة الأساسية وسكرتارية المدرسة الأساسية.</w:t>
+      </w:r>
+    </w:p>
+    <w:p>
+      <w:pPr>
+        <w:pStyle w:val="ListParagraph"/>
+        <w:numPr>
+          <w:ilvl w:val="0"/>
+          <w:numId w:val="3"/>
+        </w:numPr>
+        <w:bidi/>
+        <w:spacing w:after="100" w:line="300"/>
+        <w:jc w:val="left"/>
+      </w:pPr>
+      <w:r>
+        <w:rPr>
+          <w:rFonts w:ascii="Noto Sans Arabic" w:cs="Noto Sans Arabic" w:eastAsia="Noto Sans Arabic" w:hAnsi="Noto Sans Arabic"/>
+          <w:rtl/>
+          <w:lang w:bidi="ar-SA"/>
+        </w:rPr>
+        <w:t xml:space="preserve">المناطق المشتركة: الأوراتوريو (إضافة إلى المدير وأمين الصندوق).</w:t>
+      </w:r>
+    </w:p>
+    <w:p>
+      <w:pPr>
+        <w:bidi/>
+        <w:spacing w:after="160" w:line="300"/>
+        <w:jc w:val="left"/>
+      </w:pPr>
+      <w:r>
+        <w:rPr>
+          <w:rFonts w:ascii="Noto Sans Arabic" w:cs="Noto Sans Arabic" w:eastAsia="Noto Sans Arabic" w:hAnsi="Noto Sans Arabic"/>
+          <w:rtl/>
+          <w:lang w:bidi="ar-SA"/>
+        </w:rPr>
+        <w:t xml:space="preserve">يرى كل شخص في إدارة الحجوزات حجوزات قسمه فقط، ولا يصل إشعار طلب الحجز الجديد إلا لمن يمكنه الموافقة عليه. يحدد القسم المسؤول الفصل المحجوز ووقت البداية؛ أما القسم المضاف يدوياً فيوافق عليه المدير وأمين الصندوق فقط.</w:t>
       </w:r>
     </w:p>
     <w:p>
@@ -1089,7 +1260,7 @@
         </w:pBdr>
         <w:bidi/>
         <w:spacing w:after="160" w:before="320"/>
-        <w:jc w:val="right"/>
+        <w:jc w:val="left"/>
       </w:pPr>
       <w:r>
         <w:rPr>
@@ -1109,7 +1280,7 @@
       <w:pPr>
         <w:bidi/>
         <w:spacing w:after="160" w:line="300"/>
-        <w:jc w:val="right"/>
+        <w:jc w:val="left"/>
       </w:pPr>
       <w:r>
         <w:rPr>
@@ -1124,7 +1295,7 @@
       <w:pPr>
         <w:bidi/>
         <w:spacing w:after="160" w:line="300"/>
-        <w:jc w:val="right"/>
+        <w:jc w:val="left"/>
       </w:pPr>
       <w:r>
         <w:rPr>
@@ -1139,7 +1310,7 @@
       <w:pPr>
         <w:bidi/>
         <w:spacing w:after="160" w:line="300"/>
-        <w:jc w:val="right"/>
+        <w:jc w:val="left"/>
       </w:pPr>
       <w:r>
         <w:rPr>
@@ -1154,7 +1325,7 @@
       <w:pPr>
         <w:bidi/>
         <w:spacing w:after="160" w:line="300"/>
-        <w:jc w:val="right"/>
+        <w:jc w:val="left"/>
       </w:pPr>
       <w:r>
         <w:rPr>
@@ -1173,7 +1344,7 @@
         </w:pBdr>
         <w:bidi/>
         <w:spacing w:after="160" w:before="320"/>
-        <w:jc w:val="right"/>
+        <w:jc w:val="left"/>
       </w:pPr>
       <w:r>
         <w:rPr>
@@ -1194,7 +1365,7 @@
         <w:pStyle w:val="Heading2"/>
         <w:bidi/>
         <w:spacing w:after="160" w:before="320"/>
-        <w:jc w:val="right"/>
+        <w:jc w:val="left"/>
       </w:pPr>
       <w:r>
         <w:rPr>
@@ -1214,7 +1385,7 @@
       <w:pPr>
         <w:bidi/>
         <w:spacing w:after="160" w:line="300"/>
-        <w:jc w:val="right"/>
+        <w:jc w:val="left"/>
       </w:pPr>
       <w:r>
         <w:rPr>
@@ -1230,7 +1401,7 @@
         <w:pStyle w:val="Heading2"/>
         <w:bidi/>
         <w:spacing w:after="160" w:before="320"/>
-        <w:jc w:val="right"/>
+        <w:jc w:val="left"/>
       </w:pPr>
       <w:r>
         <w:rPr>
@@ -1250,7 +1421,7 @@
       <w:pPr>
         <w:bidi/>
         <w:spacing w:after="160" w:line="300"/>
-        <w:jc w:val="right"/>
+        <w:jc w:val="left"/>
       </w:pPr>
       <w:r>
         <w:rPr>
@@ -1266,7 +1437,7 @@
         <w:pStyle w:val="Heading2"/>
         <w:bidi/>
         <w:spacing w:after="160" w:before="320"/>
-        <w:jc w:val="right"/>
+        <w:jc w:val="left"/>
       </w:pPr>
       <w:r>
         <w:rPr>
@@ -1286,15 +1457,15 @@
       <w:pPr>
         <w:bidi/>
         <w:spacing w:after="160" w:line="300"/>
-        <w:jc w:val="right"/>
-      </w:pPr>
-      <w:r>
-        <w:rPr>
-          <w:rFonts w:ascii="Noto Sans Arabic" w:cs="Noto Sans Arabic" w:eastAsia="Noto Sans Arabic" w:hAnsi="Noto Sans Arabic"/>
-          <w:rtl/>
-          <w:lang w:bidi="ar-SA"/>
-        </w:rPr>
-        <w:t xml:space="preserve">يحذف نهائياً وبشكل لا رجعة فيه كل الحجوزات أو كل بلاغات الصيانة المؤرشفة في شهر أو سنة مختارة. يجب استخدامه بحذر: يطلب التطبيق دائماً تأكيداً صريحاً قبل المتابعة.</w:t>
+        <w:jc w:val="left"/>
+      </w:pPr>
+      <w:r>
+        <w:rPr>
+          <w:rFonts w:ascii="Noto Sans Arabic" w:cs="Noto Sans Arabic" w:eastAsia="Noto Sans Arabic" w:hAnsi="Noto Sans Arabic"/>
+          <w:rtl/>
+          <w:lang w:bidi="ar-SA"/>
+        </w:rPr>
+        <w:t xml:space="preserve">يحذف نهائياً وبشكل لا رجعة فيه كل الحجوزات أو كل بلاغات الصيانة المؤرشفة في شهر أو سنة مختارة. بالنسبة لبلاغات الصيانة يتم حذف المحلولة فقط افتراضياً؛ أما خيار «حذف البلاغات غير المحلولة أيضاً» (غير مفعّل افتراضياً) فيشمل كذلك البلاغات التي لا تزال مفتوحة، مثلاً بلاغات قاعة تم حذفها. يجب استخدامه بحذر: يبيّن التطبيق عدد البلاغات التي سيتم حذفها (وكم منها غير محلول) ويطلب دائماً تأكيداً صريحاً قبل المتابعة.</w:t>
       </w:r>
     </w:p>
     <w:p>
@@ -1305,7 +1476,7 @@
         </w:pBdr>
         <w:bidi/>
         <w:spacing w:after="160" w:before="320"/>
-        <w:jc w:val="right"/>
+        <w:jc w:val="left"/>
       </w:pPr>
       <w:r>
         <w:rPr>
@@ -1325,7 +1496,7 @@
       <w:pPr>
         <w:bidi/>
         <w:spacing w:after="160" w:line="300"/>
-        <w:jc w:val="right"/>
+        <w:jc w:val="left"/>
       </w:pPr>
       <w:r>
         <w:rPr>
@@ -1340,22 +1511,22 @@
       <w:pPr>
         <w:bidi/>
         <w:spacing w:after="160" w:line="300"/>
-        <w:jc w:val="right"/>
-      </w:pPr>
-      <w:r>
-        <w:rPr>
-          <w:rFonts w:ascii="Noto Sans Arabic" w:cs="Noto Sans Arabic" w:eastAsia="Noto Sans Arabic" w:hAnsi="Noto Sans Arabic"/>
-          <w:rtl/>
-          <w:lang w:bidi="ar-SA"/>
-        </w:rPr>
-        <w:t xml:space="preserve">"+ إضافة فصل" يطلب النوع (إعدادية/معهد صناعي) والاسم (مثل "1A"). بالنسبة للفصول بحاجة للتصنيف، يتوفر في وضع التعديل زرّان سريعان لإسنادها جميعاً دفعة واحدة إلى إعدادية أو معهد صناعي.</w:t>
-      </w:r>
-    </w:p>
-    <w:p>
-      <w:pPr>
-        <w:bidi/>
-        <w:spacing w:after="160" w:line="300"/>
-        <w:jc w:val="right"/>
+        <w:jc w:val="left"/>
+      </w:pPr>
+      <w:r>
+        <w:rPr>
+          <w:rFonts w:ascii="Noto Sans Arabic" w:cs="Noto Sans Arabic" w:eastAsia="Noto Sans Arabic" w:hAnsi="Noto Sans Arabic"/>
+          <w:rtl/>
+          <w:lang w:bidi="ar-SA"/>
+        </w:rPr>
+        <w:t xml:space="preserve">"+ إضافة فصل" يطلب النوع (إعدادية/معهد صناعي) والاسم (مثل "١A"). بالنسبة للفصول بحاجة للتصنيف، يتوفر في وضع التعديل زرّان سريعان لإسنادها جميعاً دفعة واحدة إلى إعدادية أو معهد صناعي.</w:t>
+      </w:r>
+    </w:p>
+    <w:p>
+      <w:pPr>
+        <w:bidi/>
+        <w:spacing w:after="160" w:line="300"/>
+        <w:jc w:val="left"/>
       </w:pPr>
       <w:r>
         <w:rPr>
@@ -1364,6 +1535,21 @@
           <w:lang w:bidi="ar-SA"/>
         </w:rPr>
         <w:t xml:space="preserve">هذا التصنيف مهم: يغذّي مباشرة قائمة الفصول المتاحة في وحدة قاعة الدراسة، والتي تُصفّى تلقائياً حسب نوع المدرسة.</w:t>
+      </w:r>
+    </w:p>
+    <w:p>
+      <w:pPr>
+        <w:bidi/>
+        <w:spacing w:after="160" w:line="300"/>
+        <w:jc w:val="left"/>
+      </w:pPr>
+      <w:r>
+        <w:rPr>
+          <w:rFonts w:ascii="Noto Sans Arabic" w:cs="Noto Sans Arabic" w:eastAsia="Noto Sans Arabic" w:hAnsi="Noto Sans Arabic"/>
+          <w:rtl/>
+          <w:lang w:bidi="ar-SA"/>
+        </w:rPr>
+        <w:t xml:space="preserve">تُحدَّد لكل فصل أيضاً السعة، وللفصول IPI السنة (١ أو ٢ أو ٣؛ الخيار «تلقائي» يستخرجها من أول رقم في الاسم، مثلاً «٢B» ← السنة الثانية). تحدد السنة من يوافق على الحجوزات (راجع الفصل ٥). تظهر الفصول كقاعات قابلة للحجز في البند الثابت «الفصول» في التعليم الأساسي (الإعدادية) وفي المعهد الصناعي (IPI).</w:t>
       </w:r>
     </w:p>
     <w:p>
@@ -1374,7 +1560,7 @@
         </w:pBdr>
         <w:bidi/>
         <w:spacing w:after="160" w:before="320"/>
-        <w:jc w:val="right"/>
+        <w:jc w:val="left"/>
       </w:pPr>
       <w:r>
         <w:rPr>
@@ -1394,7 +1580,7 @@
       <w:pPr>
         <w:bidi/>
         <w:spacing w:after="160" w:line="300"/>
-        <w:jc w:val="right"/>
+        <w:jc w:val="left"/>
       </w:pPr>
       <w:r>
         <w:rPr>
@@ -1409,7 +1595,7 @@
       <w:pPr>
         <w:bidi/>
         <w:spacing w:after="160" w:line="300"/>
-        <w:jc w:val="right"/>
+        <w:jc w:val="left"/>
       </w:pPr>
       <w:r>
         <w:rPr>
@@ -1424,7 +1610,7 @@
       <w:pPr>
         <w:bidi/>
         <w:spacing w:after="160" w:line="300"/>
-        <w:jc w:val="right"/>
+        <w:jc w:val="left"/>
       </w:pPr>
       <w:r>
         <w:rPr>
@@ -1443,7 +1629,7 @@
         </w:pBdr>
         <w:bidi/>
         <w:spacing w:after="160" w:before="320"/>
-        <w:jc w:val="right"/>
+        <w:jc w:val="left"/>
       </w:pPr>
       <w:r>
         <w:rPr>
@@ -1463,7 +1649,7 @@
       <w:pPr>
         <w:bidi/>
         <w:spacing w:after="160" w:line="300"/>
-        <w:jc w:val="right"/>
+        <w:jc w:val="left"/>
       </w:pPr>
       <w:r>
         <w:rPr>
@@ -1478,7 +1664,7 @@
       <w:pPr>
         <w:bidi/>
         <w:spacing w:after="160" w:line="300"/>
-        <w:jc w:val="right"/>
+        <w:jc w:val="left"/>
       </w:pPr>
       <w:r>
         <w:rPr>
@@ -1523,7 +1709,7 @@
           <w:p>
             <w:pPr>
               <w:bidi/>
-              <w:jc w:val="right"/>
+              <w:jc w:val="left"/>
             </w:pPr>
             <w:r>
               <w:rPr>
@@ -1554,7 +1740,7 @@
           <w:p>
             <w:pPr>
               <w:bidi/>
-              <w:jc w:val="right"/>
+              <w:jc w:val="left"/>
             </w:pPr>
             <w:r>
               <w:rPr>
@@ -1586,7 +1772,7 @@
           <w:p>
             <w:pPr>
               <w:bidi/>
-              <w:jc w:val="right"/>
+              <w:jc w:val="left"/>
             </w:pPr>
             <w:r>
               <w:rPr>
@@ -1613,7 +1799,7 @@
           <w:p>
             <w:pPr>
               <w:bidi/>
-              <w:jc w:val="right"/>
+              <w:jc w:val="left"/>
             </w:pPr>
             <w:r>
               <w:rPr>
@@ -1643,7 +1829,7 @@
           <w:p>
             <w:pPr>
               <w:bidi/>
-              <w:jc w:val="right"/>
+              <w:jc w:val="left"/>
             </w:pPr>
             <w:r>
               <w:rPr>
@@ -1671,7 +1857,7 @@
           <w:p>
             <w:pPr>
               <w:bidi/>
-              <w:jc w:val="right"/>
+              <w:jc w:val="left"/>
             </w:pPr>
             <w:r>
               <w:rPr>
@@ -1700,7 +1886,7 @@
           <w:p>
             <w:pPr>
               <w:bidi/>
-              <w:jc w:val="right"/>
+              <w:jc w:val="left"/>
             </w:pPr>
             <w:r>
               <w:rPr>
@@ -1727,7 +1913,7 @@
           <w:p>
             <w:pPr>
               <w:bidi/>
-              <w:jc w:val="right"/>
+              <w:jc w:val="left"/>
             </w:pPr>
             <w:r>
               <w:rPr>
@@ -1757,7 +1943,7 @@
           <w:p>
             <w:pPr>
               <w:bidi/>
-              <w:jc w:val="right"/>
+              <w:jc w:val="left"/>
             </w:pPr>
             <w:r>
               <w:rPr>
@@ -1785,7 +1971,7 @@
           <w:p>
             <w:pPr>
               <w:bidi/>
-              <w:jc w:val="right"/>
+              <w:jc w:val="left"/>
             </w:pPr>
             <w:r>
               <w:rPr>
@@ -1814,7 +2000,7 @@
           <w:p>
             <w:pPr>
               <w:bidi/>
-              <w:jc w:val="right"/>
+              <w:jc w:val="left"/>
             </w:pPr>
             <w:r>
               <w:rPr>
@@ -1841,7 +2027,7 @@
           <w:p>
             <w:pPr>
               <w:bidi/>
-              <w:jc w:val="right"/>
+              <w:jc w:val="left"/>
             </w:pPr>
             <w:r>
               <w:rPr>
@@ -1871,7 +2057,7 @@
           <w:p>
             <w:pPr>
               <w:bidi/>
-              <w:jc w:val="right"/>
+              <w:jc w:val="left"/>
             </w:pPr>
             <w:r>
               <w:rPr>
@@ -1899,7 +2085,7 @@
           <w:p>
             <w:pPr>
               <w:bidi/>
-              <w:jc w:val="right"/>
+              <w:jc w:val="left"/>
             </w:pPr>
             <w:r>
               <w:rPr>
@@ -1928,7 +2114,7 @@
           <w:p>
             <w:pPr>
               <w:bidi/>
-              <w:jc w:val="right"/>
+              <w:jc w:val="left"/>
             </w:pPr>
             <w:r>
               <w:rPr>
@@ -1955,7 +2141,7 @@
           <w:p>
             <w:pPr>
               <w:bidi/>
-              <w:jc w:val="right"/>
+              <w:jc w:val="left"/>
             </w:pPr>
             <w:r>
               <w:rPr>
@@ -1985,7 +2171,7 @@
           <w:p>
             <w:pPr>
               <w:bidi/>
-              <w:jc w:val="right"/>
+              <w:jc w:val="left"/>
             </w:pPr>
             <w:r>
               <w:rPr>
@@ -2013,7 +2199,7 @@
           <w:p>
             <w:pPr>
               <w:bidi/>
-              <w:jc w:val="right"/>
+              <w:jc w:val="left"/>
             </w:pPr>
             <w:r>
               <w:rPr>
@@ -2042,7 +2228,7 @@
           <w:p>
             <w:pPr>
               <w:bidi/>
-              <w:jc w:val="right"/>
+              <w:jc w:val="left"/>
             </w:pPr>
             <w:r>
               <w:rPr>
@@ -2069,7 +2255,7 @@
           <w:p>
             <w:pPr>
               <w:bidi/>
-              <w:jc w:val="right"/>
+              <w:jc w:val="left"/>
             </w:pPr>
             <w:r>
               <w:rPr>
@@ -2099,7 +2285,7 @@
           <w:p>
             <w:pPr>
               <w:bidi/>
-              <w:jc w:val="right"/>
+              <w:jc w:val="left"/>
             </w:pPr>
             <w:r>
               <w:rPr>
@@ -2127,7 +2313,7 @@
           <w:p>
             <w:pPr>
               <w:bidi/>
-              <w:jc w:val="right"/>
+              <w:jc w:val="left"/>
             </w:pPr>
             <w:r>
               <w:rPr>
@@ -2156,7 +2342,7 @@
           <w:p>
             <w:pPr>
               <w:bidi/>
-              <w:jc w:val="right"/>
+              <w:jc w:val="left"/>
             </w:pPr>
             <w:r>
               <w:rPr>
@@ -2183,7 +2369,7 @@
           <w:p>
             <w:pPr>
               <w:bidi/>
-              <w:jc w:val="right"/>
+              <w:jc w:val="left"/>
             </w:pPr>
             <w:r>
               <w:rPr>
@@ -2213,7 +2399,7 @@
           <w:p>
             <w:pPr>
               <w:bidi/>
-              <w:jc w:val="right"/>
+              <w:jc w:val="left"/>
             </w:pPr>
             <w:r>
               <w:rPr>
@@ -2241,7 +2427,7 @@
           <w:p>
             <w:pPr>
               <w:bidi/>
-              <w:jc w:val="right"/>
+              <w:jc w:val="left"/>
             </w:pPr>
             <w:r>
               <w:rPr>
@@ -2270,7 +2456,7 @@
           <w:p>
             <w:pPr>
               <w:bidi/>
-              <w:jc w:val="right"/>
+              <w:jc w:val="left"/>
             </w:pPr>
             <w:r>
               <w:rPr>
@@ -2297,7 +2483,7 @@
           <w:p>
             <w:pPr>
               <w:bidi/>
-              <w:jc w:val="right"/>
+              <w:jc w:val="left"/>
             </w:pPr>
             <w:r>
               <w:rPr>
@@ -2327,7 +2513,7 @@
           <w:p>
             <w:pPr>
               <w:bidi/>
-              <w:jc w:val="right"/>
+              <w:jc w:val="left"/>
             </w:pPr>
             <w:r>
               <w:rPr>
@@ -2355,7 +2541,7 @@
           <w:p>
             <w:pPr>
               <w:bidi/>
-              <w:jc w:val="right"/>
+              <w:jc w:val="left"/>
             </w:pPr>
             <w:r>
               <w:rPr>
@@ -2384,7 +2570,7 @@
           <w:p>
             <w:pPr>
               <w:bidi/>
-              <w:jc w:val="right"/>
+              <w:jc w:val="left"/>
             </w:pPr>
             <w:r>
               <w:rPr>
@@ -2411,7 +2597,7 @@
           <w:p>
             <w:pPr>
               <w:bidi/>
-              <w:jc w:val="right"/>
+              <w:jc w:val="left"/>
             </w:pPr>
             <w:r>
               <w:rPr>
@@ -2441,7 +2627,7 @@
           <w:p>
             <w:pPr>
               <w:bidi/>
-              <w:jc w:val="right"/>
+              <w:jc w:val="left"/>
             </w:pPr>
             <w:r>
               <w:rPr>
@@ -2469,7 +2655,7 @@
           <w:p>
             <w:pPr>
               <w:bidi/>
-              <w:jc w:val="right"/>
+              <w:jc w:val="left"/>
             </w:pPr>
             <w:r>
               <w:rPr>
@@ -2494,7 +2680,7 @@
       <w:pPr>
         <w:bidi/>
         <w:spacing w:after="160" w:line="300"/>
-        <w:jc w:val="right"/>
+        <w:jc w:val="left"/>
       </w:pPr>
       <w:r>
         <w:rPr>
@@ -2513,7 +2699,7 @@
         </w:pBdr>
         <w:bidi/>
         <w:spacing w:after="160" w:before="320"/>
-        <w:jc w:val="right"/>
+        <w:jc w:val="left"/>
       </w:pPr>
       <w:r>
         <w:rPr>
@@ -2533,7 +2719,7 @@
       <w:pPr>
         <w:bidi/>
         <w:spacing w:after="160" w:line="300"/>
-        <w:jc w:val="right"/>
+        <w:jc w:val="left"/>
       </w:pPr>
       <w:r>
         <w:rPr>
@@ -2553,7 +2739,7 @@
         </w:numPr>
         <w:bidi/>
         <w:spacing w:after="100" w:line="300"/>
-        <w:jc w:val="right"/>
+        <w:jc w:val="left"/>
       </w:pPr>
       <w:r>
         <w:rPr>
@@ -2573,7 +2759,7 @@
         </w:numPr>
         <w:bidi/>
         <w:spacing w:after="100" w:line="300"/>
-        <w:jc w:val="right"/>
+        <w:jc w:val="left"/>
       </w:pPr>
       <w:r>
         <w:rPr>
@@ -2593,7 +2779,7 @@
         </w:numPr>
         <w:bidi/>
         <w:spacing w:after="100" w:line="300"/>
-        <w:jc w:val="right"/>
+        <w:jc w:val="left"/>
       </w:pPr>
       <w:r>
         <w:rPr>
@@ -2613,7 +2799,7 @@
         </w:numPr>
         <w:bidi/>
         <w:spacing w:after="100" w:line="300"/>
-        <w:jc w:val="right"/>
+        <w:jc w:val="left"/>
       </w:pPr>
       <w:r>
         <w:rPr>
@@ -2633,7 +2819,7 @@
         </w:numPr>
         <w:bidi/>
         <w:spacing w:after="100" w:line="300"/>
-        <w:jc w:val="right"/>
+        <w:jc w:val="left"/>
       </w:pPr>
       <w:r>
         <w:rPr>
@@ -2652,7 +2838,7 @@
         </w:pBdr>
         <w:bidi/>
         <w:spacing w:after="160" w:before="320"/>
-        <w:jc w:val="right"/>
+        <w:jc w:val="left"/>
       </w:pPr>
       <w:r>
         <w:rPr>
@@ -2672,7 +2858,7 @@
       <w:pPr>
         <w:bidi/>
         <w:spacing w:after="160" w:line="300"/>
-        <w:jc w:val="right"/>
+        <w:jc w:val="left"/>
       </w:pPr>
       <w:r>
         <w:rPr>
@@ -2687,7 +2873,7 @@
       <w:pPr>
         <w:bidi/>
         <w:spacing w:after="160" w:line="300"/>
-        <w:jc w:val="right"/>
+        <w:jc w:val="left"/>
       </w:pPr>
       <w:r>
         <w:rPr>
@@ -2703,7 +2889,7 @@
         <w:pStyle w:val="Heading2"/>
         <w:bidi/>
         <w:spacing w:after="160" w:before="320"/>
-        <w:jc w:val="right"/>
+        <w:jc w:val="left"/>
       </w:pPr>
       <w:r>
         <w:rPr>
@@ -2723,7 +2909,7 @@
       <w:pPr>
         <w:bidi/>
         <w:spacing w:after="160" w:line="300"/>
-        <w:jc w:val="right"/>
+        <w:jc w:val="left"/>
       </w:pPr>
       <w:r>
         <w:rPr>
@@ -2739,7 +2925,7 @@
         <w:pStyle w:val="Heading2"/>
         <w:bidi/>
         <w:spacing w:after="160" w:before="320"/>
-        <w:jc w:val="right"/>
+        <w:jc w:val="left"/>
       </w:pPr>
       <w:r>
         <w:rPr>
@@ -2759,7 +2945,7 @@
       <w:pPr>
         <w:bidi/>
         <w:spacing w:after="160" w:line="300"/>
-        <w:jc w:val="right"/>
+        <w:jc w:val="left"/>
       </w:pPr>
       <w:r>
         <w:rPr>
@@ -2774,15 +2960,15 @@
       <w:pPr>
         <w:bidi/>
         <w:spacing w:after="160" w:line="300"/>
-        <w:jc w:val="right"/>
-      </w:pPr>
-      <w:r>
-        <w:rPr>
-          <w:rFonts w:ascii="Noto Sans Arabic" w:cs="Noto Sans Arabic" w:eastAsia="Noto Sans Arabic" w:hAnsi="Noto Sans Arabic"/>
-          <w:rtl/>
-          <w:lang w:bidi="ar-SA"/>
-        </w:rPr>
-        <w:t xml:space="preserve">عند النقطة الثالثة في الفصل الدراسي، يُفتح تلقائياً اختيار بين ثلاثة إجراءات: حظر الطالب لعدد من أيام العمل قابل للتعديل (افتراضياً 5)، رفض حجزه الحالي، أو منحه فرصة أخرى دون عقوبة. حذف نقطة مخصّص فقط لمدير المعهد IPI، نائبه، أو المدير.</w:t>
+        <w:jc w:val="left"/>
+      </w:pPr>
+      <w:r>
+        <w:rPr>
+          <w:rFonts w:ascii="Noto Sans Arabic" w:cs="Noto Sans Arabic" w:eastAsia="Noto Sans Arabic" w:hAnsi="Noto Sans Arabic"/>
+          <w:rtl/>
+          <w:lang w:bidi="ar-SA"/>
+        </w:rPr>
+        <w:t xml:space="preserve">عند النقطة الثالثة في الفصل الدراسي، يُفتح تلقائياً اختيار بين ثلاثة إجراءات: حظر الطالب لعدد من أيام العمل قابل للتعديل (افتراضياً ٥)، رفض حجزه الحالي، أو منحه فرصة أخرى دون عقوبة. حذف نقطة مخصّص فقط لمدير المعهد IPI، نائبه، أو المدير.</w:t>
       </w:r>
     </w:p>
     <w:p>
@@ -2790,7 +2976,7 @@
         <w:pStyle w:val="Heading2"/>
         <w:bidi/>
         <w:spacing w:after="160" w:before="320"/>
-        <w:jc w:val="right"/>
+        <w:jc w:val="left"/>
       </w:pPr>
       <w:r>
         <w:rPr>
@@ -2810,7 +2996,7 @@
       <w:pPr>
         <w:bidi/>
         <w:spacing w:after="160" w:line="300"/>
-        <w:jc w:val="right"/>
+        <w:jc w:val="left"/>
       </w:pPr>
       <w:r>
         <w:rPr>
@@ -2825,7 +3011,7 @@
       <w:pPr>
         <w:bidi/>
         <w:spacing w:after="160" w:line="300"/>
-        <w:jc w:val="right"/>
+        <w:jc w:val="left"/>
       </w:pPr>
       <w:r>
         <w:rPr>
@@ -2844,7 +3030,7 @@
         </w:pBdr>
         <w:bidi/>
         <w:spacing w:after="160" w:before="320"/>
-        <w:jc w:val="right"/>
+        <w:jc w:val="left"/>
       </w:pPr>
       <w:r>
         <w:rPr>
@@ -2864,7 +3050,7 @@
       <w:pPr>
         <w:bidi/>
         <w:spacing w:after="160" w:line="300"/>
-        <w:jc w:val="right"/>
+        <w:jc w:val="left"/>
       </w:pPr>
       <w:r>
         <w:rPr>
@@ -2879,7 +3065,7 @@
       <w:pPr>
         <w:bidi/>
         <w:spacing w:after="160" w:line="300"/>
-        <w:jc w:val="right"/>
+        <w:jc w:val="left"/>
       </w:pPr>
       <w:r>
         <w:rPr>
@@ -2898,7 +3084,7 @@
         </w:pBdr>
         <w:bidi/>
         <w:spacing w:after="160" w:before="320"/>
-        <w:jc w:val="right"/>
+        <w:jc w:val="left"/>
       </w:pPr>
       <w:r>
         <w:rPr>
@@ -2918,7 +3104,7 @@
       <w:pPr>
         <w:bidi/>
         <w:spacing w:after="160" w:line="300"/>
-        <w:jc w:val="right"/>
+        <w:jc w:val="left"/>
       </w:pPr>
       <w:r>
         <w:rPr>
@@ -2963,7 +3149,7 @@
           <w:p>
             <w:pPr>
               <w:bidi/>
-              <w:jc w:val="right"/>
+              <w:jc w:val="left"/>
             </w:pPr>
             <w:r>
               <w:rPr>
@@ -2994,7 +3180,7 @@
           <w:p>
             <w:pPr>
               <w:bidi/>
-              <w:jc w:val="right"/>
+              <w:jc w:val="left"/>
             </w:pPr>
             <w:r>
               <w:rPr>
@@ -3026,17 +3212,17 @@
           <w:p>
             <w:pPr>
               <w:bidi/>
-              <w:jc w:val="right"/>
-            </w:pPr>
-            <w:r>
-              <w:rPr>
-                <w:rFonts w:ascii="Noto Sans Arabic" w:cs="Noto Sans Arabic" w:eastAsia="Noto Sans Arabic" w:hAnsi="Noto Sans Arabic"/>
-                <w:sz w:val="20"/>
-                <w:szCs w:val="20"/>
-                <w:rtl/>
-                <w:lang w:bidi="ar-SA"/>
-              </w:rPr>
-              <w:t xml:space="preserve">وصول كامل: المستخدمون والنطاقات، الأقسام/القاعات، الموافقة على الحجوزات، الصيانة، التصدير، إعادة تعيين البيانات، سجل النشاط، الملفات الشخصية، الفصول، الأدوار المخصّصة (إنشاء وتعيين صلاحيات)، قاعة الدراسة (كل القاعات). الدور الوحيد القادر على إعادة تعيين البيانات وتعيين صلاحيات مخصّصة.</w:t>
+              <w:jc w:val="left"/>
+            </w:pPr>
+            <w:r>
+              <w:rPr>
+                <w:rFonts w:ascii="Noto Sans Arabic" w:cs="Noto Sans Arabic" w:eastAsia="Noto Sans Arabic" w:hAnsi="Noto Sans Arabic"/>
+                <w:sz w:val="20"/>
+                <w:szCs w:val="20"/>
+                <w:rtl/>
+                <w:lang w:bidi="ar-SA"/>
+              </w:rPr>
+              <w:t xml:space="preserve">وصول كامل: المستخدمون والنطاقات، الأقسام/القاعات، الموافقة على كل الحجوزات (وحجوزاته معتمدة فوراً)، الصيانة، التصدير، إعادة تعيين البيانات، سجل النشاط، الملفات الشخصية، الفصول، الأدوار المخصّصة (إنشاء وتعيين صلاحيات)، قاعة الدراسة (كل القاعات). الدور الوحيد القادر على إعادة تعيين البيانات وتعيين صلاحيات مخصّصة.</w:t>
             </w:r>
           </w:p>
         </w:tc>
@@ -3053,7 +3239,7 @@
           <w:p>
             <w:pPr>
               <w:bidi/>
-              <w:jc w:val="right"/>
+              <w:jc w:val="left"/>
             </w:pPr>
             <w:r>
               <w:rPr>
@@ -3083,17 +3269,17 @@
           <w:p>
             <w:pPr>
               <w:bidi/>
-              <w:jc w:val="right"/>
-            </w:pPr>
-            <w:r>
-              <w:rPr>
-                <w:rFonts w:ascii="Noto Sans Arabic" w:cs="Noto Sans Arabic" w:eastAsia="Noto Sans Arabic" w:hAnsi="Noto Sans Arabic"/>
-                <w:sz w:val="20"/>
-                <w:szCs w:val="20"/>
-                <w:rtl/>
-                <w:lang w:bidi="ar-SA"/>
-              </w:rPr>
-              <w:t xml:space="preserve">المستخدمون/النطاقات، الأقسام/القاعات، الموافقة على الحجوزات، تصدير المستخدمين/الحجوزات، الأدوار المخصّصة، الفصول، الملفات الشخصية (عرض وتعديل)، قاعة الدراسة مقتصرة على المعهد الصناعي.</w:t>
+              <w:jc w:val="left"/>
+            </w:pPr>
+            <w:r>
+              <w:rPr>
+                <w:rFonts w:ascii="Noto Sans Arabic" w:cs="Noto Sans Arabic" w:eastAsia="Noto Sans Arabic" w:hAnsi="Noto Sans Arabic"/>
+                <w:sz w:val="20"/>
+                <w:szCs w:val="20"/>
+                <w:rtl/>
+                <w:lang w:bidi="ar-SA"/>
+              </w:rPr>
+              <w:t xml:space="preserve">المستخدمون/النطاقات، الأقسام/القاعات، الموافقة على الحجوزات (المعهد الصناعي فقط)، تصدير المستخدمين/الحجوزات، الأدوار المخصّصة، الفصول، الملفات الشخصية (عرض وتعديل)، قاعة الدراسة مقتصرة على المعهد الصناعي.</w:t>
             </w:r>
           </w:p>
         </w:tc>
@@ -3111,7 +3297,7 @@
           <w:p>
             <w:pPr>
               <w:bidi/>
-              <w:jc w:val="right"/>
+              <w:jc w:val="left"/>
             </w:pPr>
             <w:r>
               <w:rPr>
@@ -3140,17 +3326,17 @@
           <w:p>
             <w:pPr>
               <w:bidi/>
-              <w:jc w:val="right"/>
-            </w:pPr>
-            <w:r>
-              <w:rPr>
-                <w:rFonts w:ascii="Noto Sans Arabic" w:cs="Noto Sans Arabic" w:eastAsia="Noto Sans Arabic" w:hAnsi="Noto Sans Arabic"/>
-                <w:sz w:val="20"/>
-                <w:szCs w:val="20"/>
-                <w:rtl/>
-                <w:lang w:bidi="ar-SA"/>
-              </w:rPr>
-              <w:t xml:space="preserve">نفس صلاحيات السكرتارية IPI، لكن قاعة الدراسة مقتصرة على الإعدادية.</w:t>
+              <w:jc w:val="left"/>
+            </w:pPr>
+            <w:r>
+              <w:rPr>
+                <w:rFonts w:ascii="Noto Sans Arabic" w:cs="Noto Sans Arabic" w:eastAsia="Noto Sans Arabic" w:hAnsi="Noto Sans Arabic"/>
+                <w:sz w:val="20"/>
+                <w:szCs w:val="20"/>
+                <w:rtl/>
+                <w:lang w:bidi="ar-SA"/>
+              </w:rPr>
+              <w:t xml:space="preserve">نفس صلاحيات السكرتارية IPI، لكن قاعة الدراسة مقتصرة على الإعدادية؛ ويوافق على حجوزات التعليم الأساسي فقط.</w:t>
             </w:r>
           </w:p>
         </w:tc>
@@ -3167,7 +3353,7 @@
           <w:p>
             <w:pPr>
               <w:bidi/>
-              <w:jc w:val="right"/>
+              <w:jc w:val="left"/>
             </w:pPr>
             <w:r>
               <w:rPr>
@@ -3197,7 +3383,7 @@
           <w:p>
             <w:pPr>
               <w:bidi/>
-              <w:jc w:val="right"/>
+              <w:jc w:val="left"/>
             </w:pPr>
             <w:r>
               <w:rPr>
@@ -3225,7 +3411,7 @@
           <w:p>
             <w:pPr>
               <w:bidi/>
-              <w:jc w:val="right"/>
+              <w:jc w:val="left"/>
             </w:pPr>
             <w:r>
               <w:rPr>
@@ -3254,7 +3440,7 @@
           <w:p>
             <w:pPr>
               <w:bidi/>
-              <w:jc w:val="right"/>
+              <w:jc w:val="left"/>
             </w:pPr>
             <w:r>
               <w:rPr>
@@ -3281,7 +3467,7 @@
           <w:p>
             <w:pPr>
               <w:bidi/>
-              <w:jc w:val="right"/>
+              <w:jc w:val="left"/>
             </w:pPr>
             <w:r>
               <w:rPr>
@@ -3311,17 +3497,17 @@
           <w:p>
             <w:pPr>
               <w:bidi/>
-              <w:jc w:val="right"/>
-            </w:pPr>
-            <w:r>
-              <w:rPr>
-                <w:rFonts w:ascii="Noto Sans Arabic" w:cs="Noto Sans Arabic" w:eastAsia="Noto Sans Arabic" w:hAnsi="Noto Sans Arabic"/>
-                <w:sz w:val="20"/>
-                <w:szCs w:val="20"/>
-                <w:rtl/>
-                <w:lang w:bidi="ar-SA"/>
-              </w:rPr>
-              <w:t xml:space="preserve">المستخدمون/النطاقات، الأقسام/القاعات، الموافقة على الحجوزات، تصدير المستخدمين/الحجوزات، الأدوار المخصّصة، الملفات الشخصية (عرض فقط)؛ قاعة الدراسة مقتصرة على الإعدادية.</w:t>
+              <w:jc w:val="left"/>
+            </w:pPr>
+            <w:r>
+              <w:rPr>
+                <w:rFonts w:ascii="Noto Sans Arabic" w:cs="Noto Sans Arabic" w:eastAsia="Noto Sans Arabic" w:hAnsi="Noto Sans Arabic"/>
+                <w:sz w:val="20"/>
+                <w:szCs w:val="20"/>
+                <w:rtl/>
+                <w:lang w:bidi="ar-SA"/>
+              </w:rPr>
+              <w:t xml:space="preserve">المستخدمون/النطاقات، الأقسام/القاعات، الموافقة على حجوزات التعليم الأساسي، تصدير المستخدمين/الحجوزات، الأدوار المخصّصة، الملفات الشخصية (عرض فقط)؛ قاعة الدراسة مقتصرة على الإعدادية.</w:t>
             </w:r>
           </w:p>
         </w:tc>
@@ -3339,7 +3525,7 @@
           <w:p>
             <w:pPr>
               <w:bidi/>
-              <w:jc w:val="right"/>
+              <w:jc w:val="left"/>
             </w:pPr>
             <w:r>
               <w:rPr>
@@ -3368,17 +3554,17 @@
           <w:p>
             <w:pPr>
               <w:bidi/>
-              <w:jc w:val="right"/>
-            </w:pPr>
-            <w:r>
-              <w:rPr>
-                <w:rFonts w:ascii="Noto Sans Arabic" w:cs="Noto Sans Arabic" w:eastAsia="Noto Sans Arabic" w:hAnsi="Noto Sans Arabic"/>
-                <w:sz w:val="20"/>
-                <w:szCs w:val="20"/>
-                <w:rtl/>
-                <w:lang w:bidi="ar-SA"/>
-              </w:rPr>
-              <w:t xml:space="preserve">نفس صلاحيات مدير المدرسة الأساسية، دون أي وصول لإدارة قاعة الدراسة.</w:t>
+              <w:jc w:val="left"/>
+            </w:pPr>
+            <w:r>
+              <w:rPr>
+                <w:rFonts w:ascii="Noto Sans Arabic" w:cs="Noto Sans Arabic" w:eastAsia="Noto Sans Arabic" w:hAnsi="Noto Sans Arabic"/>
+                <w:sz w:val="20"/>
+                <w:szCs w:val="20"/>
+                <w:rtl/>
+                <w:lang w:bidi="ar-SA"/>
+              </w:rPr>
+              <w:t xml:space="preserve">نفس صلاحيات مدير المدرسة الأساسية، دون أي وصول لإدارة قاعة الدراسة؛ ويوافق فقط على حجوزات المناطق المشتركة.</w:t>
             </w:r>
           </w:p>
         </w:tc>
@@ -3395,7 +3581,7 @@
           <w:p>
             <w:pPr>
               <w:bidi/>
-              <w:jc w:val="right"/>
+              <w:jc w:val="left"/>
             </w:pPr>
             <w:r>
               <w:rPr>
@@ -3425,17 +3611,17 @@
           <w:p>
             <w:pPr>
               <w:bidi/>
-              <w:jc w:val="right"/>
-            </w:pPr>
-            <w:r>
-              <w:rPr>
-                <w:rFonts w:ascii="Noto Sans Arabic" w:cs="Noto Sans Arabic" w:eastAsia="Noto Sans Arabic" w:hAnsi="Noto Sans Arabic"/>
-                <w:sz w:val="20"/>
-                <w:szCs w:val="20"/>
-                <w:rtl/>
-                <w:lang w:bidi="ar-SA"/>
-              </w:rPr>
-              <w:t xml:space="preserve">الأقسام/القاعات، إدارة الصيانة، تصدير الحجوزات/الصيانة، سجل النشاط. لا وصول للمستخدمين، الموافقة على الحجوزات، الفصول، أو قاعة الدراسة.</w:t>
+              <w:jc w:val="left"/>
+            </w:pPr>
+            <w:r>
+              <w:rPr>
+                <w:rFonts w:ascii="Noto Sans Arabic" w:cs="Noto Sans Arabic" w:eastAsia="Noto Sans Arabic" w:hAnsi="Noto Sans Arabic"/>
+                <w:sz w:val="20"/>
+                <w:szCs w:val="20"/>
+                <w:rtl/>
+                <w:lang w:bidi="ar-SA"/>
+              </w:rPr>
+              <w:t xml:space="preserve">وصول كامل مثل المدير (المستخدمون والنطاقات، الأقسام/القاعات، الموافقة على كل الحجوزات وحجوزاته معتمدة فوراً، الصيانة، التصدير، سجل النشاط، الملفات الشخصية، الفصول، الأدوار المخصّصة)، باستثناء إعادة تعيين البيانات وتعيين الصلاحيات المخصّصة ورفع الأدلة. لا وصول لإدارة قاعة الدراسة.</w:t>
             </w:r>
           </w:p>
         </w:tc>
@@ -3453,7 +3639,7 @@
           <w:p>
             <w:pPr>
               <w:bidi/>
-              <w:jc w:val="right"/>
+              <w:jc w:val="left"/>
             </w:pPr>
             <w:r>
               <w:rPr>
@@ -3482,7 +3668,7 @@
           <w:p>
             <w:pPr>
               <w:bidi/>
-              <w:jc w:val="right"/>
+              <w:jc w:val="left"/>
             </w:pPr>
             <w:r>
               <w:rPr>
@@ -3509,7 +3695,7 @@
           <w:p>
             <w:pPr>
               <w:bidi/>
-              <w:jc w:val="right"/>
+              <w:jc w:val="left"/>
             </w:pPr>
             <w:r>
               <w:rPr>
@@ -3539,7 +3725,7 @@
           <w:p>
             <w:pPr>
               <w:bidi/>
-              <w:jc w:val="right"/>
+              <w:jc w:val="left"/>
             </w:pPr>
             <w:r>
               <w:rPr>
@@ -3567,7 +3753,7 @@
           <w:p>
             <w:pPr>
               <w:bidi/>
-              <w:jc w:val="right"/>
+              <w:jc w:val="left"/>
             </w:pPr>
             <w:r>
               <w:rPr>
@@ -3596,7 +3782,7 @@
           <w:p>
             <w:pPr>
               <w:bidi/>
-              <w:jc w:val="right"/>
+              <w:jc w:val="left"/>
             </w:pPr>
             <w:r>
               <w:rPr>
@@ -3623,7 +3809,7 @@
           <w:p>
             <w:pPr>
               <w:bidi/>
-              <w:jc w:val="right"/>
+              <w:jc w:val="left"/>
             </w:pPr>
             <w:r>
               <w:rPr>
@@ -3653,7 +3839,7 @@
           <w:p>
             <w:pPr>
               <w:bidi/>
-              <w:jc w:val="right"/>
+              <w:jc w:val="left"/>
             </w:pPr>
             <w:r>
               <w:rPr>
@@ -3681,17 +3867,133 @@
           <w:p>
             <w:pPr>
               <w:bidi/>
-              <w:jc w:val="right"/>
-            </w:pPr>
-            <w:r>
-              <w:rPr>
-                <w:rFonts w:ascii="Noto Sans Arabic" w:cs="Noto Sans Arabic" w:eastAsia="Noto Sans Arabic" w:hAnsi="Noto Sans Arabic"/>
-                <w:sz w:val="20"/>
-                <w:szCs w:val="20"/>
-                <w:rtl/>
-                <w:lang w:bidi="ar-SA"/>
-              </w:rPr>
-              <w:t xml:space="preserve">مستخدم / TEVT</w:t>
+              <w:jc w:val="left"/>
+            </w:pPr>
+            <w:r>
+              <w:rPr>
+                <w:rFonts w:ascii="Noto Sans Arabic" w:cs="Noto Sans Arabic" w:eastAsia="Noto Sans Arabic" w:hAnsi="Noto Sans Arabic"/>
+                <w:sz w:val="20"/>
+                <w:szCs w:val="20"/>
+                <w:rtl/>
+                <w:lang w:bidi="ar-SA"/>
+              </w:rPr>
+              <w:t xml:space="preserve">مستخدم</w:t>
+            </w:r>
+          </w:p>
+        </w:tc>
+      </w:tr>
+      <w:tr>
+        <w:tc>
+          <w:tcPr>
+            <w:tcW w:type="dxa" w:w="6800"/>
+            <w:shd w:fill="F2EFE9" w:color="auto" w:val="clear"/>
+            <w:tcMar>
+              <w:top w:type="dxa" w:w="80"/>
+              <w:left w:type="dxa" w:w="100"/>
+              <w:bottom w:type="dxa" w:w="80"/>
+              <w:right w:type="dxa" w:w="100"/>
+            </w:tcMar>
+          </w:tcPr>
+          <w:p>
+            <w:pPr>
+              <w:bidi/>
+              <w:jc w:val="left"/>
+            </w:pPr>
+            <w:r>
+              <w:rPr>
+                <w:rFonts w:ascii="Noto Sans Arabic" w:cs="Noto Sans Arabic" w:eastAsia="Noto Sans Arabic" w:hAnsi="Noto Sans Arabic"/>
+                <w:sz w:val="20"/>
+                <w:szCs w:val="20"/>
+                <w:rtl/>
+                <w:lang w:bidi="ar-SA"/>
+              </w:rPr>
+              <w:t xml:space="preserve">الموافقة فقط على حجوزات قسم TEVT، ومن الساعة ١٦:٠٠ على حجوزات فصول السنة الثانية في المعهد الصناعي. لا صلاحيات إدارية أخرى.</w:t>
+            </w:r>
+          </w:p>
+        </w:tc>
+        <w:tc>
+          <w:tcPr>
+            <w:tcW w:type="dxa" w:w="2400"/>
+            <w:shd w:fill="F2EFE9" w:color="auto" w:val="clear"/>
+            <w:tcMar>
+              <w:top w:type="dxa" w:w="80"/>
+              <w:left w:type="dxa" w:w="100"/>
+              <w:bottom w:type="dxa" w:w="80"/>
+              <w:right w:type="dxa" w:w="100"/>
+            </w:tcMar>
+          </w:tcPr>
+          <w:p>
+            <w:pPr>
+              <w:bidi/>
+              <w:jc w:val="left"/>
+            </w:pPr>
+            <w:r>
+              <w:rPr>
+                <w:rFonts w:ascii="Noto Sans Arabic" w:cs="Noto Sans Arabic" w:eastAsia="Noto Sans Arabic" w:hAnsi="Noto Sans Arabic"/>
+                <w:sz w:val="20"/>
+                <w:szCs w:val="20"/>
+                <w:rtl/>
+                <w:lang w:bidi="ar-SA"/>
+              </w:rPr>
+              <w:t xml:space="preserve">مسؤول TEVT</w:t>
+            </w:r>
+          </w:p>
+        </w:tc>
+      </w:tr>
+      <w:tr>
+        <w:tc>
+          <w:tcPr>
+            <w:tcW w:type="dxa" w:w="6800"/>
+            <w:shd w:fill="F2EFE9" w:color="auto" w:val="clear"/>
+            <w:tcMar>
+              <w:top w:type="dxa" w:w="80"/>
+              <w:left w:type="dxa" w:w="100"/>
+              <w:bottom w:type="dxa" w:w="80"/>
+              <w:right w:type="dxa" w:w="100"/>
+            </w:tcMar>
+          </w:tcPr>
+          <w:p>
+            <w:pPr>
+              <w:bidi/>
+              <w:jc w:val="left"/>
+            </w:pPr>
+            <w:r>
+              <w:rPr>
+                <w:rFonts w:ascii="Noto Sans Arabic" w:cs="Noto Sans Arabic" w:eastAsia="Noto Sans Arabic" w:hAnsi="Noto Sans Arabic"/>
+                <w:sz w:val="20"/>
+                <w:szCs w:val="20"/>
+                <w:rtl/>
+                <w:lang w:bidi="ar-SA"/>
+              </w:rPr>
+              <w:t xml:space="preserve">نفس صلاحيات مسؤول TEVT.</w:t>
+            </w:r>
+          </w:p>
+        </w:tc>
+        <w:tc>
+          <w:tcPr>
+            <w:tcW w:type="dxa" w:w="2400"/>
+            <w:shd w:fill="F2EFE9" w:color="auto" w:val="clear"/>
+            <w:tcMar>
+              <w:top w:type="dxa" w:w="80"/>
+              <w:left w:type="dxa" w:w="100"/>
+              <w:bottom w:type="dxa" w:w="80"/>
+              <w:right w:type="dxa" w:w="100"/>
+            </w:tcMar>
+          </w:tcPr>
+          <w:p>
+            <w:pPr>
+              <w:bidi/>
+              <w:jc w:val="left"/>
+            </w:pPr>
+            <w:r>
+              <w:rPr>
+                <w:rFonts w:ascii="Noto Sans Arabic" w:cs="Noto Sans Arabic" w:eastAsia="Noto Sans Arabic" w:hAnsi="Noto Sans Arabic"/>
+                <w:sz w:val="20"/>
+                <w:szCs w:val="20"/>
+                <w:rtl/>
+                <w:lang w:bidi="ar-SA"/>
+              </w:rPr>
+              <w:t xml:space="preserve">سكرتارية TEVT</w:t>
             </w:r>
           </w:p>
         </w:tc>
@@ -3706,7 +4008,7 @@
       <w:pPr>
         <w:bidi/>
         <w:spacing w:after="160" w:line="300"/>
-        <w:jc w:val="right"/>
+        <w:jc w:val="left"/>
       </w:pPr>
       <w:r>
         <w:rPr>

</xml_diff>